<commit_message>
vault backup: 2026-04-30 15:15:39
</commit_message>
<xml_diff>
--- a/docs/05-governance/people-ops/policies/员工手册-打印版.docx
+++ b/docs/05-governance/people-ops/policies/员工手册-打印版.docx
@@ -2424,23 +2424,7 @@
         <ns0:rPr>
           <ns0:rFonts ns0:hint="eastAsia"/>
         </ns0:rPr>
-        <ns0:t>姓名：</ns0:t>
-      </ns0:r>
-      <ns0:r>
-        <ns0:rPr>
-          <ns0:rFonts ns0:hint="eastAsia"/>
-          <ns0:u ns0:val="single"/>
-        </ns0:rPr>
-        <ns0:t>　　　　　　　　　　　</ns0:t>
-      </ns0:r>
-      <ns0:r>
-        <ns0:t xml:space="preserve">　　</ns0:t>
-      </ns0:r>
-      <ns0:r>
-        <ns0:rPr>
-          <ns0:rFonts ns0:hint="eastAsia"/>
-        </ns0:rPr>
-        <ns0:t>签字：</ns0:t>
+        <ns0:t>员工签字：</ns0:t>
       </ns0:r>
       <ns0:r>
         <ns0:rPr>
@@ -2575,6 +2559,9 @@
     <w:pPr>
       <w:pStyle w:val="Header"/>
       <w:jc w:val="center"/>
+      <w:pBdr>
+        <w:bottom w:val="single" w:sz="4" w:space="1" w:color="AAAAAA"/>
+      </w:pBdr>
     </w:pPr>
     <w:r>
       <w:rPr>

</xml_diff>